<commit_message>
docs: update en & cn documents
</commit_message>
<xml_diff>
--- a/public/demo/attachment/可视化发布流向节点树拓扑图在线构建.docx
+++ b/public/demo/attachment/可视化发布流向节点树拓扑图在线构建.docx
@@ -364,7 +364,7 @@
           </w:tcPr>
           <w:p>
             <w:r>
-              <w:t xml:space="preserve">张雨绮</w:t>
+              <w:t xml:space="preserve">许曼妮</w:t>
             </w:r>
           </w:p>
         </w:tc>
@@ -417,7 +417,7 @@
           </w:tcPr>
           <w:p>
             <w:r>
-              <w:t xml:space="preserve">张雨绮</w:t>
+              <w:t xml:space="preserve">许曼妮</w:t>
             </w:r>
           </w:p>
         </w:tc>

</xml_diff>